<commit_message>
Point E (axes Bark fig1/fig3) + intégration CSV v3 (σ/IQR dans tableaux) + régénération complète v5
</commit_message>
<xml_diff>
--- a/Versions-html-and-docx/section_sax_v5.docx
+++ b/Versions-html-and-docx/section_sax_v5.docx
@@ -2849,144 +2849,158 @@
         <w:tc>
           <w:tcPr>
             <w:tcW w:type="dxa" w:w="2721"/>
-          </w:tcPr>
-          <w:p>
-            <w:pPr>
-              <w:jc w:val="center"/>
-            </w:pPr>
-            <w:r/>
-            <w:r>
-              <w:rPr>
-                <w:b/>
-                <w:sz w:val="18"/>
-              </w:rPr>
-              <w:t>glissando</w:t>
+            <w:shd w:fill="DFF0D8"/>
+          </w:tcPr>
+          <w:p>
+            <w:pPr>
+              <w:jc w:val="center"/>
+            </w:pPr>
+            <w:r/>
+            <w:r>
+              <w:rPr>
+                <w:b w:val="0"/>
+                <w:color w:val="787878"/>
+                <w:sz w:val="14"/>
+              </w:rPr>
+              <w:t>↳ σ / [Q25–Q75]</w:t>
             </w:r>
           </w:p>
         </w:tc>
         <w:tc>
           <w:tcPr>
             <w:tcW w:type="dxa" w:w="624"/>
-          </w:tcPr>
-          <w:p>
-            <w:pPr>
-              <w:jc w:val="center"/>
-            </w:pPr>
-            <w:r/>
-            <w:r>
-              <w:rPr>
-                <w:b w:val="0"/>
-                <w:sz w:val="18"/>
-              </w:rPr>
-              <w:t>30</w:t>
+            <w:shd w:fill="DFF0D8"/>
+          </w:tcPr>
+          <w:p>
+            <w:pPr>
+              <w:jc w:val="center"/>
+            </w:pPr>
+            <w:r/>
+            <w:r>
+              <w:rPr>
+                <w:b w:val="0"/>
+                <w:sz w:val="14"/>
+              </w:rPr>
             </w:r>
           </w:p>
         </w:tc>
         <w:tc>
           <w:tcPr>
             <w:tcW w:type="dxa" w:w="737"/>
-          </w:tcPr>
-          <w:p>
-            <w:pPr>
-              <w:jc w:val="center"/>
-            </w:pPr>
-            <w:r/>
-            <w:r>
-              <w:rPr>
-                <w:b w:val="0"/>
-                <w:sz w:val="18"/>
-              </w:rPr>
-              <w:t>355</w:t>
+            <w:shd w:fill="DFF0D8"/>
+          </w:tcPr>
+          <w:p>
+            <w:pPr>
+              <w:jc w:val="center"/>
+            </w:pPr>
+            <w:r/>
+            <w:r>
+              <w:rPr>
+                <w:b w:val="0"/>
+                <w:color w:val="787878"/>
+                <w:sz w:val="14"/>
+              </w:rPr>
+              <w:t>σ=205 [226–549]</w:t>
             </w:r>
           </w:p>
         </w:tc>
         <w:tc>
           <w:tcPr>
             <w:tcW w:type="dxa" w:w="737"/>
-          </w:tcPr>
-          <w:p>
-            <w:pPr>
-              <w:jc w:val="center"/>
-            </w:pPr>
-            <w:r/>
-            <w:r>
-              <w:rPr>
-                <w:b w:val="0"/>
-                <w:sz w:val="18"/>
-              </w:rPr>
-              <w:t>711</w:t>
+            <w:shd w:fill="DFF0D8"/>
+          </w:tcPr>
+          <w:p>
+            <w:pPr>
+              <w:jc w:val="center"/>
+            </w:pPr>
+            <w:r/>
+            <w:r>
+              <w:rPr>
+                <w:b w:val="0"/>
+                <w:color w:val="787878"/>
+                <w:sz w:val="14"/>
+              </w:rPr>
+              <w:t>σ=430 [528–1238]</w:t>
             </w:r>
           </w:p>
         </w:tc>
         <w:tc>
           <w:tcPr>
             <w:tcW w:type="dxa" w:w="737"/>
-          </w:tcPr>
-          <w:p>
-            <w:pPr>
-              <w:jc w:val="center"/>
-            </w:pPr>
-            <w:r/>
-            <w:r>
-              <w:rPr>
-                <w:b w:val="0"/>
-                <w:sz w:val="18"/>
-              </w:rPr>
-              <w:t>1 087</w:t>
+            <w:shd w:fill="DFF0D8"/>
+          </w:tcPr>
+          <w:p>
+            <w:pPr>
+              <w:jc w:val="center"/>
+            </w:pPr>
+            <w:r/>
+            <w:r>
+              <w:rPr>
+                <w:b w:val="0"/>
+                <w:color w:val="787878"/>
+                <w:sz w:val="14"/>
+              </w:rPr>
+              <w:t>σ=468 [894–1550]</w:t>
             </w:r>
           </w:p>
         </w:tc>
         <w:tc>
           <w:tcPr>
             <w:tcW w:type="dxa" w:w="737"/>
-          </w:tcPr>
-          <w:p>
-            <w:pPr>
-              <w:jc w:val="center"/>
-            </w:pPr>
-            <w:r/>
-            <w:r>
-              <w:rPr>
-                <w:b w:val="0"/>
-                <w:sz w:val="18"/>
-              </w:rPr>
-              <w:t>1 712</w:t>
+            <w:shd w:fill="DFF0D8"/>
+          </w:tcPr>
+          <w:p>
+            <w:pPr>
+              <w:jc w:val="center"/>
+            </w:pPr>
+            <w:r/>
+            <w:r>
+              <w:rPr>
+                <w:b w:val="0"/>
+                <w:color w:val="787878"/>
+                <w:sz w:val="14"/>
+              </w:rPr>
+              <w:t>σ=606</w:t>
             </w:r>
           </w:p>
         </w:tc>
         <w:tc>
           <w:tcPr>
             <w:tcW w:type="dxa" w:w="737"/>
-          </w:tcPr>
-          <w:p>
-            <w:pPr>
-              <w:jc w:val="center"/>
-            </w:pPr>
-            <w:r/>
-            <w:r>
-              <w:rPr>
-                <w:b w:val="0"/>
-                <w:sz w:val="18"/>
-              </w:rPr>
-              <w:t>2 046</w:t>
+            <w:shd w:fill="DFF0D8"/>
+          </w:tcPr>
+          <w:p>
+            <w:pPr>
+              <w:jc w:val="center"/>
+            </w:pPr>
+            <w:r/>
+            <w:r>
+              <w:rPr>
+                <w:b w:val="0"/>
+                <w:color w:val="787878"/>
+                <w:sz w:val="14"/>
+              </w:rPr>
+              <w:t>σ=652</w:t>
             </w:r>
           </w:p>
         </w:tc>
         <w:tc>
           <w:tcPr>
             <w:tcW w:type="dxa" w:w="737"/>
-          </w:tcPr>
-          <w:p>
-            <w:pPr>
-              <w:jc w:val="center"/>
-            </w:pPr>
-            <w:r/>
-            <w:r>
-              <w:rPr>
-                <w:b w:val="0"/>
-                <w:sz w:val="18"/>
-              </w:rPr>
-              <w:t>2 530</w:t>
+            <w:shd w:fill="DFF0D8"/>
+          </w:tcPr>
+          <w:p>
+            <w:pPr>
+              <w:jc w:val="center"/>
+            </w:pPr>
+            <w:r/>
+            <w:r>
+              <w:rPr>
+                <w:b w:val="0"/>
+                <w:color w:val="787878"/>
+                <w:sz w:val="14"/>
+              </w:rPr>
+              <w:t>σ=684</w:t>
             </w:r>
           </w:p>
         </w:tc>
@@ -3006,7 +3020,7 @@
                 <w:b/>
                 <w:sz w:val="18"/>
               </w:rPr>
-              <w:t>harmonic_fingering</w:t>
+              <w:t>glissando</w:t>
             </w:r>
           </w:p>
         </w:tc>
@@ -3024,7 +3038,7 @@
                 <w:b w:val="0"/>
                 <w:sz w:val="18"/>
               </w:rPr>
-              <w:t>9</w:t>
+              <w:t>30</w:t>
             </w:r>
           </w:p>
         </w:tc>
@@ -3042,7 +3056,7 @@
                 <w:b w:val="0"/>
                 <w:sz w:val="18"/>
               </w:rPr>
-              <w:t>484</w:t>
+              <w:t>355</w:t>
             </w:r>
           </w:p>
         </w:tc>
@@ -3060,7 +3074,7 @@
                 <w:b w:val="0"/>
                 <w:sz w:val="18"/>
               </w:rPr>
-              <w:t>1 270</w:t>
+              <w:t>711</w:t>
             </w:r>
           </w:p>
         </w:tc>
@@ -3078,7 +3092,7 @@
                 <w:b w:val="0"/>
                 <w:sz w:val="18"/>
               </w:rPr>
-              <w:t>2 013</w:t>
+              <w:t>1 087</w:t>
             </w:r>
           </w:p>
         </w:tc>
@@ -3096,7 +3110,7 @@
                 <w:b w:val="0"/>
                 <w:sz w:val="18"/>
               </w:rPr>
-              <w:t>2 282</w:t>
+              <w:t>1 712</w:t>
             </w:r>
           </w:p>
         </w:tc>
@@ -3114,7 +3128,7 @@
                 <w:b w:val="0"/>
                 <w:sz w:val="18"/>
               </w:rPr>
-              <w:t>2 638</w:t>
+              <w:t>2 046</w:t>
             </w:r>
           </w:p>
         </w:tc>
@@ -3132,7 +3146,7 @@
                 <w:b w:val="0"/>
                 <w:sz w:val="18"/>
               </w:rPr>
-              <w:t>3 208</w:t>
+              <w:t>2 530</w:t>
             </w:r>
           </w:p>
         </w:tc>
@@ -3152,7 +3166,7 @@
                 <w:b/>
                 <w:sz w:val="18"/>
               </w:rPr>
-              <w:t>harmonics_glissando</w:t>
+              <w:t>harmonic_fingering</w:t>
             </w:r>
           </w:p>
         </w:tc>
@@ -3170,7 +3184,7 @@
                 <w:b w:val="0"/>
                 <w:sz w:val="18"/>
               </w:rPr>
-              <w:t>1</w:t>
+              <w:t>9</w:t>
             </w:r>
           </w:p>
         </w:tc>
@@ -3188,7 +3202,7 @@
                 <w:b w:val="0"/>
                 <w:sz w:val="18"/>
               </w:rPr>
-              <w:t>388</w:t>
+              <w:t>484</w:t>
             </w:r>
           </w:p>
         </w:tc>
@@ -3206,7 +3220,7 @@
                 <w:b w:val="0"/>
                 <w:sz w:val="18"/>
               </w:rPr>
-              <w:t>743</w:t>
+              <w:t>1 270</w:t>
             </w:r>
           </w:p>
         </w:tc>
@@ -3224,7 +3238,7 @@
                 <w:b w:val="0"/>
                 <w:sz w:val="18"/>
               </w:rPr>
-              <w:t>1 873</w:t>
+              <w:t>2 013</w:t>
             </w:r>
           </w:p>
         </w:tc>
@@ -3242,7 +3256,7 @@
                 <w:b w:val="0"/>
                 <w:sz w:val="18"/>
               </w:rPr>
-              <w:t>2 143</w:t>
+              <w:t>2 282</w:t>
             </w:r>
           </w:p>
         </w:tc>
@@ -3260,7 +3274,7 @@
                 <w:b w:val="0"/>
                 <w:sz w:val="18"/>
               </w:rPr>
-              <w:t>2 692</w:t>
+              <w:t>2 638</w:t>
             </w:r>
           </w:p>
         </w:tc>
@@ -3278,7 +3292,7 @@
                 <w:b w:val="0"/>
                 <w:sz w:val="18"/>
               </w:rPr>
-              <w:t>3 370</w:t>
+              <w:t>3 208</w:t>
             </w:r>
           </w:p>
         </w:tc>
@@ -3298,7 +3312,7 @@
                 <w:b/>
                 <w:sz w:val="18"/>
               </w:rPr>
-              <w:t>key_click</w:t>
+              <w:t>harmonics_glissando</w:t>
             </w:r>
           </w:p>
         </w:tc>
@@ -3316,7 +3330,7 @@
                 <w:b w:val="0"/>
                 <w:sz w:val="18"/>
               </w:rPr>
-              <w:t>12</w:t>
+              <w:t>1</w:t>
             </w:r>
           </w:p>
         </w:tc>
@@ -3334,7 +3348,7 @@
                 <w:b w:val="0"/>
                 <w:sz w:val="18"/>
               </w:rPr>
-              <w:t>258</w:t>
+              <w:t>388</w:t>
             </w:r>
           </w:p>
         </w:tc>
@@ -3352,7 +3366,7 @@
                 <w:b w:val="0"/>
                 <w:sz w:val="18"/>
               </w:rPr>
-              <w:t>560</w:t>
+              <w:t>743</w:t>
             </w:r>
           </w:p>
         </w:tc>
@@ -3370,7 +3384,7 @@
                 <w:b w:val="0"/>
                 <w:sz w:val="18"/>
               </w:rPr>
-              <w:t>915</w:t>
+              <w:t>1 873</w:t>
             </w:r>
           </w:p>
         </w:tc>
@@ -3388,7 +3402,7 @@
                 <w:b w:val="0"/>
                 <w:sz w:val="18"/>
               </w:rPr>
-              <w:t>1 292</w:t>
+              <w:t>2 143</w:t>
             </w:r>
           </w:p>
         </w:tc>
@@ -3406,7 +3420,7 @@
                 <w:b w:val="0"/>
                 <w:sz w:val="18"/>
               </w:rPr>
-              <w:t>1 680</w:t>
+              <w:t>2 692</w:t>
             </w:r>
           </w:p>
         </w:tc>
@@ -3424,7 +3438,7 @@
                 <w:b w:val="0"/>
                 <w:sz w:val="18"/>
               </w:rPr>
-              <w:t>2 282</w:t>
+              <w:t>3 370</w:t>
             </w:r>
           </w:p>
         </w:tc>
@@ -3444,7 +3458,7 @@
                 <w:b/>
                 <w:sz w:val="18"/>
               </w:rPr>
-              <w:t>kiss</w:t>
+              <w:t>key_click</w:t>
             </w:r>
           </w:p>
         </w:tc>
@@ -3462,7 +3476,7 @@
                 <w:b w:val="0"/>
                 <w:sz w:val="18"/>
               </w:rPr>
-              <w:t>1</w:t>
+              <w:t>12</w:t>
             </w:r>
           </w:p>
         </w:tc>
@@ -3480,6 +3494,24 @@
                 <w:b w:val="0"/>
                 <w:sz w:val="18"/>
               </w:rPr>
+              <w:t>258</w:t>
+            </w:r>
+          </w:p>
+        </w:tc>
+        <w:tc>
+          <w:tcPr>
+            <w:tcW w:type="dxa" w:w="737"/>
+          </w:tcPr>
+          <w:p>
+            <w:pPr>
+              <w:jc w:val="center"/>
+            </w:pPr>
+            <w:r/>
+            <w:r>
+              <w:rPr>
+                <w:b w:val="0"/>
+                <w:sz w:val="18"/>
+              </w:rPr>
               <w:t>560</w:t>
             </w:r>
           </w:p>
@@ -3498,7 +3530,7 @@
                 <w:b w:val="0"/>
                 <w:sz w:val="18"/>
               </w:rPr>
-              <w:t>1 077</w:t>
+              <w:t>915</w:t>
             </w:r>
           </w:p>
         </w:tc>
@@ -3516,7 +3548,7 @@
                 <w:b w:val="0"/>
                 <w:sz w:val="18"/>
               </w:rPr>
-              <w:t>1 400</w:t>
+              <w:t>1 292</w:t>
             </w:r>
           </w:p>
         </w:tc>
@@ -3534,7 +3566,7 @@
                 <w:b w:val="0"/>
                 <w:sz w:val="18"/>
               </w:rPr>
-              <w:t>1 669</w:t>
+              <w:t>1 680</w:t>
             </w:r>
           </w:p>
         </w:tc>
@@ -3552,25 +3584,7 @@
                 <w:b w:val="0"/>
                 <w:sz w:val="18"/>
               </w:rPr>
-              <w:t>2 013</w:t>
-            </w:r>
-          </w:p>
-        </w:tc>
-        <w:tc>
-          <w:tcPr>
-            <w:tcW w:type="dxa" w:w="737"/>
-          </w:tcPr>
-          <w:p>
-            <w:pPr>
-              <w:jc w:val="center"/>
-            </w:pPr>
-            <w:r/>
-            <w:r>
-              <w:rPr>
-                <w:b w:val="0"/>
-                <w:sz w:val="18"/>
-              </w:rPr>
-              <w:t>2 272</w:t>
+              <w:t>2 282</w:t>
             </w:r>
           </w:p>
         </w:tc>
@@ -3590,7 +3604,7 @@
                 <w:b/>
                 <w:sz w:val="18"/>
               </w:rPr>
-              <w:t>move_bell_from_down_to_up</w:t>
+              <w:t>kiss</w:t>
             </w:r>
           </w:p>
         </w:tc>
@@ -3608,7 +3622,7 @@
                 <w:b w:val="0"/>
                 <w:sz w:val="18"/>
               </w:rPr>
-              <w:t>6</w:t>
+              <w:t>1</w:t>
             </w:r>
           </w:p>
         </w:tc>
@@ -3644,7 +3658,7 @@
                 <w:b w:val="0"/>
                 <w:sz w:val="18"/>
               </w:rPr>
-              <w:t>1 120</w:t>
+              <w:t>1 077</w:t>
             </w:r>
           </w:p>
         </w:tc>
@@ -3662,6 +3676,24 @@
                 <w:b w:val="0"/>
                 <w:sz w:val="18"/>
               </w:rPr>
+              <w:t>1 400</w:t>
+            </w:r>
+          </w:p>
+        </w:tc>
+        <w:tc>
+          <w:tcPr>
+            <w:tcW w:type="dxa" w:w="737"/>
+          </w:tcPr>
+          <w:p>
+            <w:pPr>
+              <w:jc w:val="center"/>
+            </w:pPr>
+            <w:r/>
+            <w:r>
+              <w:rPr>
+                <w:b w:val="0"/>
+                <w:sz w:val="18"/>
+              </w:rPr>
               <w:t>1 669</w:t>
             </w:r>
           </w:p>
@@ -3680,7 +3712,7 @@
                 <w:b w:val="0"/>
                 <w:sz w:val="18"/>
               </w:rPr>
-              <w:t>2 218</w:t>
+              <w:t>2 013</w:t>
             </w:r>
           </w:p>
         </w:tc>
@@ -3698,25 +3730,7 @@
                 <w:b w:val="0"/>
                 <w:sz w:val="18"/>
               </w:rPr>
-              <w:t>2 778</w:t>
-            </w:r>
-          </w:p>
-        </w:tc>
-        <w:tc>
-          <w:tcPr>
-            <w:tcW w:type="dxa" w:w="737"/>
-          </w:tcPr>
-          <w:p>
-            <w:pPr>
-              <w:jc w:val="center"/>
-            </w:pPr>
-            <w:r/>
-            <w:r>
-              <w:rPr>
-                <w:b w:val="0"/>
-                <w:sz w:val="18"/>
-              </w:rPr>
-              <w:t>3 338</w:t>
+              <w:t>2 272</w:t>
             </w:r>
           </w:p>
         </w:tc>
@@ -3736,7 +3750,7 @@
                 <w:b/>
                 <w:sz w:val="18"/>
               </w:rPr>
-              <w:t>move_bell_from_left_to_right</w:t>
+              <w:t>move_bell_from_down_to_up</w:t>
             </w:r>
           </w:p>
         </w:tc>
@@ -3772,7 +3786,7 @@
                 <w:b w:val="0"/>
                 <w:sz w:val="18"/>
               </w:rPr>
-              <w:t>549</w:t>
+              <w:t>560</w:t>
             </w:r>
           </w:p>
         </w:tc>
@@ -3844,7 +3858,7 @@
                 <w:b w:val="0"/>
                 <w:sz w:val="18"/>
               </w:rPr>
-              <w:t>2 767</w:t>
+              <w:t>2 778</w:t>
             </w:r>
           </w:p>
         </w:tc>
@@ -3862,7 +3876,7 @@
                 <w:b w:val="0"/>
                 <w:sz w:val="18"/>
               </w:rPr>
-              <w:t>3 327</w:t>
+              <w:t>3 338</w:t>
             </w:r>
           </w:p>
         </w:tc>
@@ -3882,7 +3896,7 @@
                 <w:b/>
                 <w:sz w:val="18"/>
               </w:rPr>
-              <w:t>multiphonics</w:t>
+              <w:t>move_bell_from_left_to_right</w:t>
             </w:r>
           </w:p>
         </w:tc>
@@ -3900,7 +3914,7 @@
                 <w:b w:val="0"/>
                 <w:sz w:val="18"/>
               </w:rPr>
-              <w:t>47</w:t>
+              <w:t>6</w:t>
             </w:r>
           </w:p>
         </w:tc>
@@ -3918,7 +3932,7 @@
                 <w:b w:val="0"/>
                 <w:sz w:val="18"/>
               </w:rPr>
-              <w:t>409</w:t>
+              <w:t>549</w:t>
             </w:r>
           </w:p>
         </w:tc>
@@ -3936,7 +3950,7 @@
                 <w:b w:val="0"/>
                 <w:sz w:val="18"/>
               </w:rPr>
-              <w:t>754</w:t>
+              <w:t>1 120</w:t>
             </w:r>
           </w:p>
         </w:tc>
@@ -3954,7 +3968,7 @@
                 <w:b w:val="0"/>
                 <w:sz w:val="18"/>
               </w:rPr>
-              <w:t>1 324</w:t>
+              <w:t>1 669</w:t>
             </w:r>
           </w:p>
         </w:tc>
@@ -3972,7 +3986,7 @@
                 <w:b w:val="0"/>
                 <w:sz w:val="18"/>
               </w:rPr>
-              <w:t>1 820</w:t>
+              <w:t>2 218</w:t>
             </w:r>
           </w:p>
         </w:tc>
@@ -3990,7 +4004,7 @@
                 <w:b w:val="0"/>
                 <w:sz w:val="18"/>
               </w:rPr>
-              <w:t>2 153</w:t>
+              <w:t>2 767</w:t>
             </w:r>
           </w:p>
         </w:tc>
@@ -4008,7 +4022,7 @@
                 <w:b w:val="0"/>
                 <w:sz w:val="18"/>
               </w:rPr>
-              <w:t>2 509</w:t>
+              <w:t>3 327</w:t>
             </w:r>
           </w:p>
         </w:tc>
@@ -4017,6 +4031,152 @@
         <w:tc>
           <w:tcPr>
             <w:tcW w:type="dxa" w:w="2721"/>
+          </w:tcPr>
+          <w:p>
+            <w:pPr>
+              <w:jc w:val="center"/>
+            </w:pPr>
+            <w:r/>
+            <w:r>
+              <w:rPr>
+                <w:b/>
+                <w:sz w:val="18"/>
+              </w:rPr>
+              <w:t>multiphonics</w:t>
+            </w:r>
+          </w:p>
+        </w:tc>
+        <w:tc>
+          <w:tcPr>
+            <w:tcW w:type="dxa" w:w="624"/>
+          </w:tcPr>
+          <w:p>
+            <w:pPr>
+              <w:jc w:val="center"/>
+            </w:pPr>
+            <w:r/>
+            <w:r>
+              <w:rPr>
+                <w:b w:val="0"/>
+                <w:sz w:val="18"/>
+              </w:rPr>
+              <w:t>47</w:t>
+            </w:r>
+          </w:p>
+        </w:tc>
+        <w:tc>
+          <w:tcPr>
+            <w:tcW w:type="dxa" w:w="737"/>
+          </w:tcPr>
+          <w:p>
+            <w:pPr>
+              <w:jc w:val="center"/>
+            </w:pPr>
+            <w:r/>
+            <w:r>
+              <w:rPr>
+                <w:b w:val="0"/>
+                <w:sz w:val="18"/>
+              </w:rPr>
+              <w:t>409</w:t>
+            </w:r>
+          </w:p>
+        </w:tc>
+        <w:tc>
+          <w:tcPr>
+            <w:tcW w:type="dxa" w:w="737"/>
+          </w:tcPr>
+          <w:p>
+            <w:pPr>
+              <w:jc w:val="center"/>
+            </w:pPr>
+            <w:r/>
+            <w:r>
+              <w:rPr>
+                <w:b w:val="0"/>
+                <w:sz w:val="18"/>
+              </w:rPr>
+              <w:t>754</w:t>
+            </w:r>
+          </w:p>
+        </w:tc>
+        <w:tc>
+          <w:tcPr>
+            <w:tcW w:type="dxa" w:w="737"/>
+          </w:tcPr>
+          <w:p>
+            <w:pPr>
+              <w:jc w:val="center"/>
+            </w:pPr>
+            <w:r/>
+            <w:r>
+              <w:rPr>
+                <w:b w:val="0"/>
+                <w:sz w:val="18"/>
+              </w:rPr>
+              <w:t>1 324</w:t>
+            </w:r>
+          </w:p>
+        </w:tc>
+        <w:tc>
+          <w:tcPr>
+            <w:tcW w:type="dxa" w:w="737"/>
+          </w:tcPr>
+          <w:p>
+            <w:pPr>
+              <w:jc w:val="center"/>
+            </w:pPr>
+            <w:r/>
+            <w:r>
+              <w:rPr>
+                <w:b w:val="0"/>
+                <w:sz w:val="18"/>
+              </w:rPr>
+              <w:t>1 820</w:t>
+            </w:r>
+          </w:p>
+        </w:tc>
+        <w:tc>
+          <w:tcPr>
+            <w:tcW w:type="dxa" w:w="737"/>
+          </w:tcPr>
+          <w:p>
+            <w:pPr>
+              <w:jc w:val="center"/>
+            </w:pPr>
+            <w:r/>
+            <w:r>
+              <w:rPr>
+                <w:b w:val="0"/>
+                <w:sz w:val="18"/>
+              </w:rPr>
+              <w:t>2 153</w:t>
+            </w:r>
+          </w:p>
+        </w:tc>
+        <w:tc>
+          <w:tcPr>
+            <w:tcW w:type="dxa" w:w="737"/>
+          </w:tcPr>
+          <w:p>
+            <w:pPr>
+              <w:jc w:val="center"/>
+            </w:pPr>
+            <w:r/>
+            <w:r>
+              <w:rPr>
+                <w:b w:val="0"/>
+                <w:sz w:val="18"/>
+              </w:rPr>
+              <w:t>2 509</w:t>
+            </w:r>
+          </w:p>
+        </w:tc>
+      </w:tr>
+      <w:tr>
+        <w:tc>
+          <w:tcPr>
+            <w:tcW w:type="dxa" w:w="2721"/>
             <w:shd w:fill="DFF0D8"/>
           </w:tcPr>
           <w:p>
@@ -4180,10 +4340,11 @@
             <w:r/>
             <w:r>
               <w:rPr>
-                <w:b/>
-                <w:sz w:val="18"/>
-              </w:rPr>
-              <w:t>ordinario_high_register</w:t>
+                <w:b w:val="0"/>
+                <w:color w:val="787878"/>
+                <w:sz w:val="14"/>
+              </w:rPr>
+              <w:t>↳ σ / [Q25–Q75]</w:t>
             </w:r>
           </w:p>
         </w:tc>
@@ -4200,9 +4361,8 @@
             <w:r>
               <w:rPr>
                 <w:b w:val="0"/>
-                <w:sz w:val="18"/>
-              </w:rPr>
-              <w:t>42</w:t>
+                <w:sz w:val="14"/>
+              </w:rPr>
             </w:r>
           </w:p>
         </w:tc>
@@ -4219,9 +4379,10 @@
             <w:r>
               <w:rPr>
                 <w:b w:val="0"/>
-                <w:sz w:val="18"/>
-              </w:rPr>
-              <w:t>1 389</w:t>
+                <w:color w:val="787878"/>
+                <w:sz w:val="14"/>
+              </w:rPr>
+              <w:t>σ=231 [215–592]</w:t>
             </w:r>
           </w:p>
         </w:tc>
@@ -4238,9 +4399,10 @@
             <w:r>
               <w:rPr>
                 <w:b w:val="0"/>
-                <w:sz w:val="18"/>
-              </w:rPr>
-              <w:t>2 358</w:t>
+                <w:color w:val="787878"/>
+                <w:sz w:val="14"/>
+              </w:rPr>
+              <w:t>σ=526 [560–1400]</w:t>
             </w:r>
           </w:p>
         </w:tc>
@@ -4257,9 +4419,10 @@
             <w:r>
               <w:rPr>
                 <w:b w:val="0"/>
-                <w:sz w:val="18"/>
-              </w:rPr>
-              <w:t>3 510</w:t>
+                <w:color w:val="787878"/>
+                <w:sz w:val="14"/>
+              </w:rPr>
+              <w:t>σ=601 [969–1873]</w:t>
             </w:r>
           </w:p>
         </w:tc>
@@ -4276,9 +4439,10 @@
             <w:r>
               <w:rPr>
                 <w:b w:val="0"/>
-                <w:sz w:val="18"/>
-              </w:rPr>
-              <w:t>3 758</w:t>
+                <w:color w:val="787878"/>
+                <w:sz w:val="14"/>
+              </w:rPr>
+              <w:t>σ=676</w:t>
             </w:r>
           </w:p>
         </w:tc>
@@ -4295,9 +4459,10 @@
             <w:r>
               <w:rPr>
                 <w:b w:val="0"/>
-                <w:sz w:val="18"/>
-              </w:rPr>
-              <w:t>4 167</w:t>
+                <w:color w:val="787878"/>
+                <w:sz w:val="14"/>
+              </w:rPr>
+              <w:t>σ=823</w:t>
             </w:r>
           </w:p>
         </w:tc>
@@ -4314,9 +4479,10 @@
             <w:r>
               <w:rPr>
                 <w:b w:val="0"/>
-                <w:sz w:val="18"/>
-              </w:rPr>
-              <w:t>5 006</w:t>
+                <w:color w:val="787878"/>
+                <w:sz w:val="14"/>
+              </w:rPr>
+              <w:t>σ=1031</w:t>
             </w:r>
           </w:p>
         </w:tc>
@@ -4337,7 +4503,7 @@
                 <w:b/>
                 <w:sz w:val="18"/>
               </w:rPr>
-              <w:t>ordinario_quartertones</w:t>
+              <w:t>ordinario_high_register</w:t>
             </w:r>
           </w:p>
         </w:tc>
@@ -4356,7 +4522,7 @@
                 <w:b w:val="0"/>
                 <w:sz w:val="18"/>
               </w:rPr>
-              <w:t>87</w:t>
+              <w:t>42</w:t>
             </w:r>
           </w:p>
         </w:tc>
@@ -4375,7 +4541,7 @@
                 <w:b w:val="0"/>
                 <w:sz w:val="18"/>
               </w:rPr>
-              <w:t>409</w:t>
+              <w:t>1 389</w:t>
             </w:r>
           </w:p>
         </w:tc>
@@ -4394,7 +4560,7 @@
                 <w:b w:val="0"/>
                 <w:sz w:val="18"/>
               </w:rPr>
-              <w:t>851</w:t>
+              <w:t>2 358</w:t>
             </w:r>
           </w:p>
         </w:tc>
@@ -4413,7 +4579,7 @@
                 <w:b w:val="0"/>
                 <w:sz w:val="18"/>
               </w:rPr>
-              <w:t>1 324</w:t>
+              <w:t>3 510</w:t>
             </w:r>
           </w:p>
         </w:tc>
@@ -4432,7 +4598,7 @@
                 <w:b w:val="0"/>
                 <w:sz w:val="18"/>
               </w:rPr>
-              <w:t>1 970</w:t>
+              <w:t>3 758</w:t>
             </w:r>
           </w:p>
         </w:tc>
@@ -4451,7 +4617,7 @@
                 <w:b w:val="0"/>
                 <w:sz w:val="18"/>
               </w:rPr>
-              <w:t>2 422</w:t>
+              <w:t>4 167</w:t>
             </w:r>
           </w:p>
         </w:tc>
@@ -4470,7 +4636,7 @@
                 <w:b w:val="0"/>
                 <w:sz w:val="18"/>
               </w:rPr>
-              <w:t>2 821</w:t>
+              <w:t>5 006</w:t>
             </w:r>
           </w:p>
         </w:tc>
@@ -4488,10 +4654,11 @@
             <w:r/>
             <w:r>
               <w:rPr>
-                <w:b/>
-                <w:sz w:val="18"/>
-              </w:rPr>
-              <w:t>ordinario_to_flatterzunge</w:t>
+                <w:b w:val="0"/>
+                <w:color w:val="787878"/>
+                <w:sz w:val="14"/>
+              </w:rPr>
+              <w:t>↳ σ / [Q25–Q75]</w:t>
             </w:r>
           </w:p>
         </w:tc>
@@ -4508,9 +4675,8 @@
             <w:r>
               <w:rPr>
                 <w:b w:val="0"/>
-                <w:sz w:val="18"/>
-              </w:rPr>
-              <w:t>31</w:t>
+                <w:sz w:val="14"/>
+              </w:rPr>
             </w:r>
           </w:p>
         </w:tc>
@@ -4527,9 +4693,10 @@
             <w:r>
               <w:rPr>
                 <w:b w:val="0"/>
-                <w:sz w:val="18"/>
-              </w:rPr>
-              <w:t>355</w:t>
+                <w:color w:val="787878"/>
+                <w:sz w:val="14"/>
+              </w:rPr>
+              <w:t>σ=324 [1109–1669]</w:t>
             </w:r>
           </w:p>
         </w:tc>
@@ -4546,9 +4713,10 @@
             <w:r>
               <w:rPr>
                 <w:b w:val="0"/>
-                <w:sz w:val="18"/>
-              </w:rPr>
-              <w:t>775</w:t>
+                <w:color w:val="787878"/>
+                <w:sz w:val="14"/>
+              </w:rPr>
+              <w:t>σ=626 [2089–2939]</w:t>
             </w:r>
           </w:p>
         </w:tc>
@@ -4565,9 +4733,10 @@
             <w:r>
               <w:rPr>
                 <w:b w:val="0"/>
-                <w:sz w:val="18"/>
-              </w:rPr>
-              <w:t>1 260</w:t>
+                <w:color w:val="787878"/>
+                <w:sz w:val="14"/>
+              </w:rPr>
+              <w:t>σ=1082 [2670–4199]</w:t>
             </w:r>
           </w:p>
         </w:tc>
@@ -4584,9 +4753,10 @@
             <w:r>
               <w:rPr>
                 <w:b w:val="0"/>
-                <w:sz w:val="18"/>
-              </w:rPr>
-              <w:t>1 733</w:t>
+                <w:color w:val="787878"/>
+                <w:sz w:val="14"/>
+              </w:rPr>
+              <w:t>σ=1184</w:t>
             </w:r>
           </w:p>
         </w:tc>
@@ -4603,9 +4773,10 @@
             <w:r>
               <w:rPr>
                 <w:b w:val="0"/>
-                <w:sz w:val="18"/>
-              </w:rPr>
-              <w:t>2 100</w:t>
+                <w:color w:val="787878"/>
+                <w:sz w:val="14"/>
+              </w:rPr>
+              <w:t>σ=898</w:t>
             </w:r>
           </w:p>
         </w:tc>
@@ -4622,9 +4793,638 @@
             <w:r>
               <w:rPr>
                 <w:b w:val="0"/>
+                <w:color w:val="787878"/>
+                <w:sz w:val="14"/>
+              </w:rPr>
+              <w:t>σ=589</w:t>
+            </w:r>
+          </w:p>
+        </w:tc>
+      </w:tr>
+      <w:tr>
+        <w:tc>
+          <w:tcPr>
+            <w:tcW w:type="dxa" w:w="2721"/>
+            <w:shd w:fill="DFF0D8"/>
+          </w:tcPr>
+          <w:p>
+            <w:pPr>
+              <w:jc w:val="center"/>
+            </w:pPr>
+            <w:r/>
+            <w:r>
+              <w:rPr>
+                <w:b/>
+                <w:sz w:val="18"/>
+              </w:rPr>
+              <w:t>ordinario_quartertones</w:t>
+            </w:r>
+          </w:p>
+        </w:tc>
+        <w:tc>
+          <w:tcPr>
+            <w:tcW w:type="dxa" w:w="624"/>
+            <w:shd w:fill="DFF0D8"/>
+          </w:tcPr>
+          <w:p>
+            <w:pPr>
+              <w:jc w:val="center"/>
+            </w:pPr>
+            <w:r/>
+            <w:r>
+              <w:rPr>
+                <w:b w:val="0"/>
+                <w:sz w:val="18"/>
+              </w:rPr>
+              <w:t>87</w:t>
+            </w:r>
+          </w:p>
+        </w:tc>
+        <w:tc>
+          <w:tcPr>
+            <w:tcW w:type="dxa" w:w="737"/>
+            <w:shd w:fill="DFF0D8"/>
+          </w:tcPr>
+          <w:p>
+            <w:pPr>
+              <w:jc w:val="center"/>
+            </w:pPr>
+            <w:r/>
+            <w:r>
+              <w:rPr>
+                <w:b w:val="0"/>
+                <w:sz w:val="18"/>
+              </w:rPr>
+              <w:t>409</w:t>
+            </w:r>
+          </w:p>
+        </w:tc>
+        <w:tc>
+          <w:tcPr>
+            <w:tcW w:type="dxa" w:w="737"/>
+            <w:shd w:fill="DFF0D8"/>
+          </w:tcPr>
+          <w:p>
+            <w:pPr>
+              <w:jc w:val="center"/>
+            </w:pPr>
+            <w:r/>
+            <w:r>
+              <w:rPr>
+                <w:b w:val="0"/>
+                <w:sz w:val="18"/>
+              </w:rPr>
+              <w:t>851</w:t>
+            </w:r>
+          </w:p>
+        </w:tc>
+        <w:tc>
+          <w:tcPr>
+            <w:tcW w:type="dxa" w:w="737"/>
+            <w:shd w:fill="DFF0D8"/>
+          </w:tcPr>
+          <w:p>
+            <w:pPr>
+              <w:jc w:val="center"/>
+            </w:pPr>
+            <w:r/>
+            <w:r>
+              <w:rPr>
+                <w:b w:val="0"/>
+                <w:sz w:val="18"/>
+              </w:rPr>
+              <w:t>1 324</w:t>
+            </w:r>
+          </w:p>
+        </w:tc>
+        <w:tc>
+          <w:tcPr>
+            <w:tcW w:type="dxa" w:w="737"/>
+            <w:shd w:fill="DFF0D8"/>
+          </w:tcPr>
+          <w:p>
+            <w:pPr>
+              <w:jc w:val="center"/>
+            </w:pPr>
+            <w:r/>
+            <w:r>
+              <w:rPr>
+                <w:b w:val="0"/>
+                <w:sz w:val="18"/>
+              </w:rPr>
+              <w:t>1 970</w:t>
+            </w:r>
+          </w:p>
+        </w:tc>
+        <w:tc>
+          <w:tcPr>
+            <w:tcW w:type="dxa" w:w="737"/>
+            <w:shd w:fill="DFF0D8"/>
+          </w:tcPr>
+          <w:p>
+            <w:pPr>
+              <w:jc w:val="center"/>
+            </w:pPr>
+            <w:r/>
+            <w:r>
+              <w:rPr>
+                <w:b w:val="0"/>
+                <w:sz w:val="18"/>
+              </w:rPr>
+              <w:t>2 422</w:t>
+            </w:r>
+          </w:p>
+        </w:tc>
+        <w:tc>
+          <w:tcPr>
+            <w:tcW w:type="dxa" w:w="737"/>
+            <w:shd w:fill="DFF0D8"/>
+          </w:tcPr>
+          <w:p>
+            <w:pPr>
+              <w:jc w:val="center"/>
+            </w:pPr>
+            <w:r/>
+            <w:r>
+              <w:rPr>
+                <w:b w:val="0"/>
+                <w:sz w:val="18"/>
+              </w:rPr>
+              <w:t>2 821</w:t>
+            </w:r>
+          </w:p>
+        </w:tc>
+      </w:tr>
+      <w:tr>
+        <w:tc>
+          <w:tcPr>
+            <w:tcW w:type="dxa" w:w="2721"/>
+            <w:shd w:fill="DFF0D8"/>
+          </w:tcPr>
+          <w:p>
+            <w:pPr>
+              <w:jc w:val="center"/>
+            </w:pPr>
+            <w:r/>
+            <w:r>
+              <w:rPr>
+                <w:b w:val="0"/>
+                <w:color w:val="787878"/>
+                <w:sz w:val="14"/>
+              </w:rPr>
+              <w:t>↳ σ / [Q25–Q75]</w:t>
+            </w:r>
+          </w:p>
+        </w:tc>
+        <w:tc>
+          <w:tcPr>
+            <w:tcW w:type="dxa" w:w="624"/>
+            <w:shd w:fill="DFF0D8"/>
+          </w:tcPr>
+          <w:p>
+            <w:pPr>
+              <w:jc w:val="center"/>
+            </w:pPr>
+            <w:r/>
+            <w:r>
+              <w:rPr>
+                <w:b w:val="0"/>
+                <w:sz w:val="14"/>
+              </w:rPr>
+            </w:r>
+          </w:p>
+        </w:tc>
+        <w:tc>
+          <w:tcPr>
+            <w:tcW w:type="dxa" w:w="737"/>
+            <w:shd w:fill="DFF0D8"/>
+          </w:tcPr>
+          <w:p>
+            <w:pPr>
+              <w:jc w:val="center"/>
+            </w:pPr>
+            <w:r/>
+            <w:r>
+              <w:rPr>
+                <w:b w:val="0"/>
+                <w:color w:val="787878"/>
+                <w:sz w:val="14"/>
+              </w:rPr>
+              <w:t>σ=212 [269–603]</w:t>
+            </w:r>
+          </w:p>
+        </w:tc>
+        <w:tc>
+          <w:tcPr>
+            <w:tcW w:type="dxa" w:w="737"/>
+            <w:shd w:fill="DFF0D8"/>
+          </w:tcPr>
+          <w:p>
+            <w:pPr>
+              <w:jc w:val="center"/>
+            </w:pPr>
+            <w:r/>
+            <w:r>
+              <w:rPr>
+                <w:b w:val="0"/>
+                <w:color w:val="787878"/>
+                <w:sz w:val="14"/>
+              </w:rPr>
+              <w:t>σ=384 [614–1227]</w:t>
+            </w:r>
+          </w:p>
+        </w:tc>
+        <w:tc>
+          <w:tcPr>
+            <w:tcW w:type="dxa" w:w="737"/>
+            <w:shd w:fill="DFF0D8"/>
+          </w:tcPr>
+          <w:p>
+            <w:pPr>
+              <w:jc w:val="center"/>
+            </w:pPr>
+            <w:r/>
+            <w:r>
+              <w:rPr>
+                <w:b w:val="0"/>
+                <w:color w:val="787878"/>
+                <w:sz w:val="14"/>
+              </w:rPr>
+              <w:t>σ=501 [990–1830]</w:t>
+            </w:r>
+          </w:p>
+        </w:tc>
+        <w:tc>
+          <w:tcPr>
+            <w:tcW w:type="dxa" w:w="737"/>
+            <w:shd w:fill="DFF0D8"/>
+          </w:tcPr>
+          <w:p>
+            <w:pPr>
+              <w:jc w:val="center"/>
+            </w:pPr>
+            <w:r/>
+            <w:r>
+              <w:rPr>
+                <w:b w:val="0"/>
+                <w:color w:val="787878"/>
+                <w:sz w:val="14"/>
+              </w:rPr>
+              <w:t>σ=558</w:t>
+            </w:r>
+          </w:p>
+        </w:tc>
+        <w:tc>
+          <w:tcPr>
+            <w:tcW w:type="dxa" w:w="737"/>
+            <w:shd w:fill="DFF0D8"/>
+          </w:tcPr>
+          <w:p>
+            <w:pPr>
+              <w:jc w:val="center"/>
+            </w:pPr>
+            <w:r/>
+            <w:r>
+              <w:rPr>
+                <w:b w:val="0"/>
+                <w:color w:val="787878"/>
+                <w:sz w:val="14"/>
+              </w:rPr>
+              <w:t>σ=600</w:t>
+            </w:r>
+          </w:p>
+        </w:tc>
+        <w:tc>
+          <w:tcPr>
+            <w:tcW w:type="dxa" w:w="737"/>
+            <w:shd w:fill="DFF0D8"/>
+          </w:tcPr>
+          <w:p>
+            <w:pPr>
+              <w:jc w:val="center"/>
+            </w:pPr>
+            <w:r/>
+            <w:r>
+              <w:rPr>
+                <w:b w:val="0"/>
+                <w:color w:val="787878"/>
+                <w:sz w:val="14"/>
+              </w:rPr>
+              <w:t>σ=729</w:t>
+            </w:r>
+          </w:p>
+        </w:tc>
+      </w:tr>
+      <w:tr>
+        <w:tc>
+          <w:tcPr>
+            <w:tcW w:type="dxa" w:w="2721"/>
+            <w:shd w:fill="DFF0D8"/>
+          </w:tcPr>
+          <w:p>
+            <w:pPr>
+              <w:jc w:val="center"/>
+            </w:pPr>
+            <w:r/>
+            <w:r>
+              <w:rPr>
+                <w:b/>
+                <w:sz w:val="18"/>
+              </w:rPr>
+              <w:t>ordinario_to_flatterzunge</w:t>
+            </w:r>
+          </w:p>
+        </w:tc>
+        <w:tc>
+          <w:tcPr>
+            <w:tcW w:type="dxa" w:w="624"/>
+            <w:shd w:fill="DFF0D8"/>
+          </w:tcPr>
+          <w:p>
+            <w:pPr>
+              <w:jc w:val="center"/>
+            </w:pPr>
+            <w:r/>
+            <w:r>
+              <w:rPr>
+                <w:b w:val="0"/>
+                <w:sz w:val="18"/>
+              </w:rPr>
+              <w:t>31</w:t>
+            </w:r>
+          </w:p>
+        </w:tc>
+        <w:tc>
+          <w:tcPr>
+            <w:tcW w:type="dxa" w:w="737"/>
+            <w:shd w:fill="DFF0D8"/>
+          </w:tcPr>
+          <w:p>
+            <w:pPr>
+              <w:jc w:val="center"/>
+            </w:pPr>
+            <w:r/>
+            <w:r>
+              <w:rPr>
+                <w:b w:val="0"/>
+                <w:sz w:val="18"/>
+              </w:rPr>
+              <w:t>355</w:t>
+            </w:r>
+          </w:p>
+        </w:tc>
+        <w:tc>
+          <w:tcPr>
+            <w:tcW w:type="dxa" w:w="737"/>
+            <w:shd w:fill="DFF0D8"/>
+          </w:tcPr>
+          <w:p>
+            <w:pPr>
+              <w:jc w:val="center"/>
+            </w:pPr>
+            <w:r/>
+            <w:r>
+              <w:rPr>
+                <w:b w:val="0"/>
+                <w:sz w:val="18"/>
+              </w:rPr>
+              <w:t>775</w:t>
+            </w:r>
+          </w:p>
+        </w:tc>
+        <w:tc>
+          <w:tcPr>
+            <w:tcW w:type="dxa" w:w="737"/>
+            <w:shd w:fill="DFF0D8"/>
+          </w:tcPr>
+          <w:p>
+            <w:pPr>
+              <w:jc w:val="center"/>
+            </w:pPr>
+            <w:r/>
+            <w:r>
+              <w:rPr>
+                <w:b w:val="0"/>
+                <w:sz w:val="18"/>
+              </w:rPr>
+              <w:t>1 260</w:t>
+            </w:r>
+          </w:p>
+        </w:tc>
+        <w:tc>
+          <w:tcPr>
+            <w:tcW w:type="dxa" w:w="737"/>
+            <w:shd w:fill="DFF0D8"/>
+          </w:tcPr>
+          <w:p>
+            <w:pPr>
+              <w:jc w:val="center"/>
+            </w:pPr>
+            <w:r/>
+            <w:r>
+              <w:rPr>
+                <w:b w:val="0"/>
+                <w:sz w:val="18"/>
+              </w:rPr>
+              <w:t>1 733</w:t>
+            </w:r>
+          </w:p>
+        </w:tc>
+        <w:tc>
+          <w:tcPr>
+            <w:tcW w:type="dxa" w:w="737"/>
+            <w:shd w:fill="DFF0D8"/>
+          </w:tcPr>
+          <w:p>
+            <w:pPr>
+              <w:jc w:val="center"/>
+            </w:pPr>
+            <w:r/>
+            <w:r>
+              <w:rPr>
+                <w:b w:val="0"/>
+                <w:sz w:val="18"/>
+              </w:rPr>
+              <w:t>2 100</w:t>
+            </w:r>
+          </w:p>
+        </w:tc>
+        <w:tc>
+          <w:tcPr>
+            <w:tcW w:type="dxa" w:w="737"/>
+            <w:shd w:fill="DFF0D8"/>
+          </w:tcPr>
+          <w:p>
+            <w:pPr>
+              <w:jc w:val="center"/>
+            </w:pPr>
+            <w:r/>
+            <w:r>
+              <w:rPr>
+                <w:b w:val="0"/>
                 <w:sz w:val="18"/>
               </w:rPr>
               <w:t>2 466</w:t>
+            </w:r>
+          </w:p>
+        </w:tc>
+      </w:tr>
+      <w:tr>
+        <w:tc>
+          <w:tcPr>
+            <w:tcW w:type="dxa" w:w="2721"/>
+            <w:shd w:fill="DFF0D8"/>
+          </w:tcPr>
+          <w:p>
+            <w:pPr>
+              <w:jc w:val="center"/>
+            </w:pPr>
+            <w:r/>
+            <w:r>
+              <w:rPr>
+                <w:b w:val="0"/>
+                <w:color w:val="787878"/>
+                <w:sz w:val="14"/>
+              </w:rPr>
+              <w:t>↳ σ / [Q25–Q75]</w:t>
+            </w:r>
+          </w:p>
+        </w:tc>
+        <w:tc>
+          <w:tcPr>
+            <w:tcW w:type="dxa" w:w="624"/>
+            <w:shd w:fill="DFF0D8"/>
+          </w:tcPr>
+          <w:p>
+            <w:pPr>
+              <w:jc w:val="center"/>
+            </w:pPr>
+            <w:r/>
+            <w:r>
+              <w:rPr>
+                <w:b w:val="0"/>
+                <w:sz w:val="14"/>
+              </w:rPr>
+            </w:r>
+          </w:p>
+        </w:tc>
+        <w:tc>
+          <w:tcPr>
+            <w:tcW w:type="dxa" w:w="737"/>
+            <w:shd w:fill="DFF0D8"/>
+          </w:tcPr>
+          <w:p>
+            <w:pPr>
+              <w:jc w:val="center"/>
+            </w:pPr>
+            <w:r/>
+            <w:r>
+              <w:rPr>
+                <w:b w:val="0"/>
+                <w:color w:val="787878"/>
+                <w:sz w:val="14"/>
+              </w:rPr>
+              <w:t>σ=260 [226–668]</w:t>
+            </w:r>
+          </w:p>
+        </w:tc>
+        <w:tc>
+          <w:tcPr>
+            <w:tcW w:type="dxa" w:w="737"/>
+            <w:shd w:fill="DFF0D8"/>
+          </w:tcPr>
+          <w:p>
+            <w:pPr>
+              <w:jc w:val="center"/>
+            </w:pPr>
+            <w:r/>
+            <w:r>
+              <w:rPr>
+                <w:b w:val="0"/>
+                <w:color w:val="787878"/>
+                <w:sz w:val="14"/>
+              </w:rPr>
+              <w:t>σ=359 [624–1303]</w:t>
+            </w:r>
+          </w:p>
+        </w:tc>
+        <w:tc>
+          <w:tcPr>
+            <w:tcW w:type="dxa" w:w="737"/>
+            <w:shd w:fill="DFF0D8"/>
+          </w:tcPr>
+          <w:p>
+            <w:pPr>
+              <w:jc w:val="center"/>
+            </w:pPr>
+            <w:r/>
+            <w:r>
+              <w:rPr>
+                <w:b w:val="0"/>
+                <w:color w:val="787878"/>
+                <w:sz w:val="14"/>
+              </w:rPr>
+              <w:t>σ=413 [1001–1712]</w:t>
+            </w:r>
+          </w:p>
+        </w:tc>
+        <w:tc>
+          <w:tcPr>
+            <w:tcW w:type="dxa" w:w="737"/>
+            <w:shd w:fill="DFF0D8"/>
+          </w:tcPr>
+          <w:p>
+            <w:pPr>
+              <w:jc w:val="center"/>
+            </w:pPr>
+            <w:r/>
+            <w:r>
+              <w:rPr>
+                <w:b w:val="0"/>
+                <w:color w:val="787878"/>
+                <w:sz w:val="14"/>
+              </w:rPr>
+              <w:t>σ=479</w:t>
+            </w:r>
+          </w:p>
+        </w:tc>
+        <w:tc>
+          <w:tcPr>
+            <w:tcW w:type="dxa" w:w="737"/>
+            <w:shd w:fill="DFF0D8"/>
+          </w:tcPr>
+          <w:p>
+            <w:pPr>
+              <w:jc w:val="center"/>
+            </w:pPr>
+            <w:r/>
+            <w:r>
+              <w:rPr>
+                <w:b w:val="0"/>
+                <w:color w:val="787878"/>
+                <w:sz w:val="14"/>
+              </w:rPr>
+              <w:t>σ=565</w:t>
+            </w:r>
+          </w:p>
+        </w:tc>
+        <w:tc>
+          <w:tcPr>
+            <w:tcW w:type="dxa" w:w="737"/>
+            <w:shd w:fill="DFF0D8"/>
+          </w:tcPr>
+          <w:p>
+            <w:pPr>
+              <w:jc w:val="center"/>
+            </w:pPr>
+            <w:r/>
+            <w:r>
+              <w:rPr>
+                <w:b w:val="0"/>
+                <w:color w:val="787878"/>
+                <w:sz w:val="14"/>
+              </w:rPr>
+              <w:t>σ=649</w:t>
             </w:r>
           </w:p>
         </w:tc>

</xml_diff>